<commit_message>
Em-dash scrub across all 26 docs (849 replacements) + author name fix
- Em dashes scrubbed and replaced with commas in all .docx files in /docs/
- CURR7003 research paper: author byline updated to Jonathan Michael Miljus
- Video Presentation Script: author byline updated to Jonathan Michael Miljus
- All other formatting preserved (bold, italic, fonts, sizes, colors)
- Files validated to still open cleanly after XML edits
</commit_message>
<xml_diff>
--- a/docs/AI_Phone_First_Toolkit.docx
+++ b/docs/AI_Phone_First_Toolkit.docx
@@ -101,7 +101,7 @@
                 <w:sz w:val="22"/>
                 <w:szCs w:val="22"/>
               </w:rPr>
-              <w:t xml:space="preserve">Free, simple, no computer required — written for adults who don't trust tech</w:t>
+              <w:t xml:space="preserve">Free, simple, no computer required, written for adults who don't trust tech</w:t>
             </w:r>
           </w:p>
           <w:p>
@@ -117,7 +117,7 @@
                 <w:sz w:val="20"/>
                 <w:szCs w:val="20"/>
               </w:rPr>
-              <w:t xml:space="preserve">Gratis, simple, sin computadora — escrito para adultos que no confían en la tecnología</w:t>
+              <w:t xml:space="preserve">Gratis, simple, sin computadora, escrito para adultos que no confían en la tecnología</w:t>
             </w:r>
           </w:p>
           <w:p>
@@ -222,7 +222,7 @@
           <w:sz w:val="22"/>
           <w:szCs w:val="22"/>
         </w:rPr>
-        <w:t xml:space="preserve">AI tools like ChatGPT have a reputation for being complicated. They're not. They're chat boxes — you type, the computer answers. The hard part isn't the tool. It's knowing the 5 things that actually help you and ignoring the other 95.</w:t>
+        <w:t xml:space="preserve">AI tools like ChatGPT have a reputation for being complicated. They're not. They're chat boxes, you type, the computer answers. The hard part isn't the tool. It's knowing the 5 things that actually help you and ignoring the other 95.</w:t>
       </w:r>
     </w:p>
     <w:p>
@@ -249,7 +249,7 @@
           <w:sz w:val="20"/>
           <w:szCs w:val="20"/>
         </w:rPr>
-        <w:t xml:space="preserve">Las herramientas de IA como ChatGPT tienen fama de complicadas. No lo son. Son cajas de chat — tú escribes, la computadora responde. Lo difícil no es la herramienta. Es saber las 5 cosas que de verdad te ayudan e ignorar las otras 95.</w:t>
+        <w:t xml:space="preserve">Las herramientas de IA como ChatGPT tienen fama de complicadas. No lo son. Son cajas de chat, tú escribes, la computadora responde. Lo difícil no es la herramienta. Es saber las 5 cosas que de verdad te ayudan e ignorar las otras 95.</w:t>
       </w:r>
     </w:p>
     <w:tbl>
@@ -380,7 +380,7 @@
           <w:sz w:val="36"/>
           <w:szCs w:val="36"/>
         </w:rPr>
-        <w:t xml:space="preserve">Setup — 5 minutes · Instalación — 5 minutos</w:t>
+        <w:t xml:space="preserve">Setup, 5 minutes · Instalación, 5 minutos</w:t>
       </w:r>
     </w:p>
     <w:p>
@@ -552,7 +552,7 @@
           <w:sz w:val="22"/>
           <w:szCs w:val="22"/>
         </w:rPr>
-        <w:t xml:space="preserve">Open the app. Sign up — you can use your Google account or your email. No credit card required for the free version.</w:t>
+        <w:t xml:space="preserve">Open the app. Sign up, you can use your Google account or your email. No credit card required for the free version.</w:t>
       </w:r>
     </w:p>
     <w:p>
@@ -580,7 +580,7 @@
           <w:sz w:val="19"/>
           <w:szCs w:val="19"/>
         </w:rPr>
-        <w:t xml:space="preserve">Abre la app. Regístrate — puedes usar tu cuenta de Google o tu correo. No se requiere tarjeta de crédito para la versión gratis.</w:t>
+        <w:t xml:space="preserve">Abre la app. Regístrate, puedes usar tu cuenta de Google o tu correo. No se requiere tarjeta de crédito para la versión gratis.</w:t>
       </w:r>
     </w:p>
     <w:p>
@@ -708,7 +708,7 @@
                 <w:sz w:val="21"/>
                 <w:szCs w:val="21"/>
               </w:rPr>
-              <w:t xml:space="preserve">Claude is great at writing and longer answers. Gemini integrates with Google. ChatGPT is the most popular and easiest to start with. Pick one. Don't switch around — you'll just confuse yourself.</w:t>
+              <w:t xml:space="preserve">Claude is great at writing and longer answers. Gemini integrates with Google. ChatGPT is the most popular and easiest to start with. Pick one. Don't switch around, you'll just confuse yourself.</w:t>
             </w:r>
           </w:p>
           <w:p>
@@ -735,7 +735,7 @@
                 <w:sz w:val="19"/>
                 <w:szCs w:val="19"/>
               </w:rPr>
-              <w:t xml:space="preserve">Claude (claude.ai) y Gemini (gemini.google.com) son ambos excelentes. Claude es bueno con escritura y respuestas largas. Gemini se integra con Google. ChatGPT es el más popular y el más fácil para empezar. Elige uno. No cambies — solo te vas a confundir.</w:t>
+              <w:t xml:space="preserve">Claude (claude.ai) y Gemini (gemini.google.com) son ambos excelentes. Claude es bueno con escritura y respuestas largas. Gemini se integra con Google. ChatGPT es el más popular y el más fácil para empezar. Elige uno. No cambies, solo te vas a confundir.</w:t>
             </w:r>
           </w:p>
         </w:tc>
@@ -1234,7 +1234,7 @@
           <w:sz w:val="22"/>
           <w:szCs w:val="22"/>
         </w:rPr>
-        <w:t xml:space="preserve">Use this for ONE sentence at a time. Don't paste paragraphs — you won't remember any of it.</w:t>
+        <w:t xml:space="preserve">Use this for ONE sentence at a time. Don't paste paragraphs, you won't remember any of it.</w:t>
       </w:r>
     </w:p>
     <w:p>
@@ -1261,7 +1261,7 @@
           <w:sz w:val="20"/>
           <w:szCs w:val="20"/>
         </w:rPr>
-        <w:t xml:space="preserve">Usa esto para UNA oración a la vez. No pegues párrafos — no vas a recordar nada.</w:t>
+        <w:t xml:space="preserve">Usa esto para UNA oración a la vez. No pegues párrafos, no vas a recordar nada.</w:t>
       </w:r>
     </w:p>
     <w:tbl>
@@ -2221,7 +2221,7 @@
           <w:sz w:val="22"/>
           <w:szCs w:val="22"/>
         </w:rPr>
-        <w:t xml:space="preserve">It feels productive — you're typing in English, the AI responds in English. But the AI adapts down to your level. It stops pushing you. After 30 minutes you're tired and you didn't actually learn anything new. Limit AI chat sessions to 5 minutes max, focused on a specific question.</w:t>
+        <w:t xml:space="preserve">It feels productive, you're typing in English, the AI responds in English. But the AI adapts down to your level. It stops pushing you. After 30 minutes you're tired and you didn't actually learn anything new. Limit AI chat sessions to 5 minutes max, focused on a specific question.</w:t>
       </w:r>
     </w:p>
     <w:p>
@@ -2248,7 +2248,7 @@
           <w:sz w:val="20"/>
           <w:szCs w:val="20"/>
         </w:rPr>
-        <w:t xml:space="preserve">Se siente productivo — escribes en inglés, la IA responde en inglés. Pero la IA se adapta hacia abajo a tu nivel. Deja de empujarte. Después de 30 minutos estás cansado y no aprendiste nada nuevo. Limita las sesiones de chat a 5 minutos máximo, enfocadas en una pregunta específica.</w:t>
+        <w:t xml:space="preserve">Se siente productivo, escribes en inglés, la IA responde en inglés. Pero la IA se adapta hacia abajo a tu nivel. Deja de empujarte. Después de 30 minutos estás cansado y no aprendiste nada nuevo. Limita las sesiones de chat a 5 minutos máximo, enfocadas en una pregunta específica.</w:t>
       </w:r>
     </w:p>
     <w:p>
@@ -2392,7 +2392,7 @@
           <w:sz w:val="22"/>
           <w:szCs w:val="22"/>
         </w:rPr>
-        <w:t xml:space="preserve">AI can't replicate the rhythm, hesitation, slang, and surprise of real conversation. You need to talk to actual humans. The AI is a tool to PREPARE for those conversations — not to replace them.</w:t>
+        <w:t xml:space="preserve">AI can't replicate the rhythm, hesitation, slang, and surprise of real conversation. You need to talk to actual humans. The AI is a tool to PREPARE for those conversations, not to replace them.</w:t>
       </w:r>
     </w:p>
     <w:p>
@@ -2419,7 +2419,7 @@
           <w:sz w:val="20"/>
           <w:szCs w:val="20"/>
         </w:rPr>
-        <w:t xml:space="preserve">La IA no puede replicar el ritmo, las pausas, el slang, y la sorpresa de una conversación real. Necesitas hablar con humanos de verdad. La IA es una herramienta para PREPARARTE para esas conversaciones — no para reemplazarlas.</w:t>
+        <w:t xml:space="preserve">La IA no puede replicar el ritmo, las pausas, el slang, y la sorpresa de una conversación real. Necesitas hablar con humanos de verdad. La IA es una herramienta para PREPARARTE para esas conversaciones, no para reemplazarlas.</w:t>
       </w:r>
     </w:p>
     <w:tbl>
@@ -2500,7 +2500,7 @@
                 <w:sz w:val="21"/>
                 <w:szCs w:val="21"/>
               </w:rPr>
-              <w:t xml:space="preserve">AI is for producing material. Anki is for locking it into memory. Your mouth is for making it usable. If you finished an AI session feeling smart but didn't add anything to Anki and didn't speak out loud — you didn't learn. You just hung out with a chatbot.</w:t>
+              <w:t xml:space="preserve">AI is for producing material. Anki is for locking it into memory. Your mouth is for making it usable. If you finished an AI session feeling smart but didn't add anything to Anki and didn't speak out loud, you didn't learn. You just hung out with a chatbot.</w:t>
             </w:r>
           </w:p>
           <w:p>
@@ -2527,7 +2527,7 @@
                 <w:sz w:val="19"/>
                 <w:szCs w:val="19"/>
               </w:rPr>
-              <w:t xml:space="preserve">La IA es para producir material. Anki es para fijarlo en la memoria. Tu boca es para hacerlo usable. Si terminaste una sesión con IA sintiéndote inteligente pero no agregaste nada a Anki y no hablaste en voz alta — no aprendiste. Solo platicaste con un chatbot.</w:t>
+              <w:t xml:space="preserve">La IA es para producir material. Anki es para fijarlo en la memoria. Tu boca es para hacerlo usable. Si terminaste una sesión con IA sintiéndote inteligente pero no agregaste nada a Anki y no hablaste en voz alta, no aprendiste. Solo platicaste con un chatbot.</w:t>
             </w:r>
           </w:p>
         </w:tc>
@@ -3018,7 +3018,7 @@
           <w:sz w:val="26"/>
           <w:szCs w:val="26"/>
         </w:rPr>
-        <w:t xml:space="preserve">AI is a tool. Like a good hammer, it makes some jobs easier — but it doesn't build the house. You build the house, with your daily 15 minutes of practice. AI just hands you the right nail at the right moment.</w:t>
+        <w:t xml:space="preserve">AI is a tool. Like a good hammer, it makes some jobs easier, but it doesn't build the house. You build the house, with your daily 15 minutes of practice. AI just hands you the right nail at the right moment.</w:t>
       </w:r>
     </w:p>
     <w:p>
@@ -3045,7 +3045,7 @@
           <w:sz w:val="21"/>
           <w:szCs w:val="21"/>
         </w:rPr>
-        <w:t xml:space="preserve">La IA es una herramienta. Como un buen martillo, hace algunos trabajos más fáciles — pero no construye la casa. Tú construyes la casa, con tus 15 minutos diarios de práctica. La IA solo te pasa el clavo correcto en el momento correcto.</w:t>
+        <w:t xml:space="preserve">La IA es una herramienta. Como un buen martillo, hace algunos trabajos más fáciles, pero no construye la casa. Tú construyes la casa, con tus 15 minutos diarios de práctica. La IA solo te pasa el clavo correcto en el momento correcto.</w:t>
       </w:r>
     </w:p>
     <w:sectPr>

</xml_diff>